<commit_message>
Planteamineto actualizado, y agregammos el hilo a la libreria del promodel
</commit_message>
<xml_diff>
--- a/Planteamiento.docx
+++ b/Planteamiento.docx
@@ -44,7 +44,7 @@
           <w:sz w:val="22"/>
           <w:szCs w:val="22"/>
         </w:rPr>
-        <w:t>En la actualidad la industria textil y la educación aun esta de la mano, y aun mas dentro de las ciudades de Moroleón y Uriangato, donde la producción de suéter escolar está muy mal optimizada.</w:t>
+        <w:t>En la actualidad, la industria textil y el sector educativo mantienen una estrecha relación, especialmente en las ciudades de Moroleón y Uriangato, donde la producción de suéter escolar representa una actividad económica importante. Sin embargo, uno de los principales problemas dentro de este proceso productivo es la mala optimización en la medición de tiempos, lo que afecta directamente la eficiencia de la producción.</w:t>
       </w:r>
     </w:p>
     <w:p>
@@ -61,7 +61,7 @@
           <w:sz w:val="22"/>
           <w:szCs w:val="22"/>
         </w:rPr>
-        <w:t>Al momento de hacer suéter escolar hay cosas que por la desinformación no se pueden medir de la manera más exacta,</w:t>
+        <w:t xml:space="preserve">Actualmente, la estimación de tiempos en la fabricación de cada pieza y de cada lote se realiza principalmente con base en la experiencia del personal, sin contar con mediciones exactas ni herramientas que permitan obtener datos precisos. Esto genera un alto margen de error en la planeación, ya que variables importantes como el tiempo por pieza, el tiempo total por lote, la cantidad de operadores, las piezas defectuosas, el consumo de hilo, el tiempo de mantenimiento, la velocidad de la </w:t>
       </w:r>
       <w:r>
         <w:rPr>
@@ -69,7 +69,15 @@
           <w:sz w:val="22"/>
           <w:szCs w:val="22"/>
         </w:rPr>
-        <w:t xml:space="preserve"> algunas como el tiempo, las piezas erróneas, y uso de la maquina solo se calculan en base a la experiencia lo que nos da un sesgo de error muy grande.</w:t>
+        <w:t>máquina</w:t>
+      </w:r>
+      <w:r>
+        <w:rPr>
+          <w:rFonts w:ascii="Arial" w:hAnsi="Arial" w:cs="Arial"/>
+          <w:sz w:val="22"/>
+          <w:szCs w:val="22"/>
+        </w:rPr>
+        <w:t>, la cantidad producida por día y los tiempos muertos no se registran de manera sistemática.</w:t>
       </w:r>
     </w:p>
     <w:p>
@@ -86,15 +94,24 @@
           <w:sz w:val="22"/>
           <w:szCs w:val="22"/>
         </w:rPr>
-        <w:t>Nuestro objetivo es poder tomar la mayor cantidad de información de este proceso para poder simular de la manera más exacta los requerimiento para poder agilizar y</w:t>
+        <w:t>La falta de información precisa provoca retrasos, baja productividad y una utilización ineficiente de los recursos disponibles, dificultando la toma de decisiones para mejorar el proceso de manufactura.</w:t>
       </w:r>
+    </w:p>
+    <w:p>
+      <w:pPr>
+        <w:rPr>
+          <w:rFonts w:ascii="Arial" w:hAnsi="Arial" w:cs="Arial"/>
+          <w:sz w:val="22"/>
+          <w:szCs w:val="22"/>
+        </w:rPr>
+      </w:pPr>
       <w:r>
         <w:rPr>
           <w:rFonts w:ascii="Arial" w:hAnsi="Arial" w:cs="Arial"/>
           <w:sz w:val="22"/>
           <w:szCs w:val="22"/>
         </w:rPr>
-        <w:t xml:space="preserve"> optimizar el proceso.</w:t>
+        <w:t>Por ello, el objetivo de este proyecto es reducir los tiempos de producción mediante la recolección y análisis de la mayor cantidad posible de información del proceso, con el fin de desarrollar una simulación que permita estimar de manera más exacta los requerimientos operativos y optimizar la producción del suéter escolar.</w:t>
       </w:r>
     </w:p>
     <w:sectPr>

</xml_diff>